<commit_message>
Rehacer guías de instrumento: 2 columnas y partitura real de percusión
Metalófono y melódica ahora usan una tabla de 2 columnas a todo el ancho
de la hoja (Primera parte | Segunda parte), igual a como aparece en la
presentación de Canva. Pandero, bombo y aplausos incorporan la imagen
real de su partitura extraída de las diapositivas 17-19 del PDF (recortada
para excluir la foto del instrumento y el fondo con grilla), en vez de una
descripción en texto del patrón rítmico.
</commit_message>
<xml_diff>
--- a/portafolio-docente-2026/clase1-guias-word/4-guia-instrumento-metalofono.docx
+++ b/portafolio-docente-2026/clase1-guias-word/4-guia-instrumento-metalofono.docx
@@ -65,7 +65,7 @@
         <w:spacing w:after="160" w:line="276" w:lineRule="auto"/>
       </w:pPr>
       <w:r>
-        <w:t xml:space="preserve">Toca la Sección A completa, dos veces (X2), y luego sigue directo con la segunda parte.</w:t>
+        <w:t xml:space="preserve">Toca la Sección A completa: primero la parte de la izquierda (se repite dos veces, X2) y luego sigues directo con la parte de la derecha.</w:t>
       </w:r>
     </w:p>
     <w:p>
@@ -73,219 +73,269 @@
         <w:spacing w:after="160" w:line="276" w:lineRule="auto"/>
       </w:pPr>
     </w:p>
-    <w:p>
-      <w:pPr>
-        <w:pStyle w:val="Heading2"/>
-        <w:spacing w:after="120" w:line="276" w:lineRule="auto"/>
-      </w:pPr>
-      <w:r>
-        <w:rPr>
-          <w:b/>
-          <w:sz w:val="26"/>
-          <w:szCs w:val="26"/>
-        </w:rPr>
-        <w:t xml:space="preserve">Primera parte (se repite X2)</w:t>
-      </w:r>
-    </w:p>
-    <w:p>
-      <w:pPr>
-        <w:spacing w:after="160" w:line="276" w:lineRule="auto"/>
-      </w:pPr>
-      <w:r>
-        <w:t xml:space="preserve">SI DO' DO'</w:t>
-      </w:r>
-    </w:p>
-    <w:p>
-      <w:pPr>
-        <w:spacing w:after="160" w:line="276" w:lineRule="auto"/>
-      </w:pPr>
-      <w:r>
-        <w:t xml:space="preserve">RE' MI' RE' DO'</w:t>
-      </w:r>
-    </w:p>
-    <w:p>
-      <w:pPr>
-        <w:spacing w:after="160" w:line="276" w:lineRule="auto"/>
-      </w:pPr>
-      <w:r>
-        <w:t xml:space="preserve">DO' DO' SI LA DO'</w:t>
-      </w:r>
-    </w:p>
-    <w:p>
-      <w:pPr>
-        <w:spacing w:after="160" w:line="276" w:lineRule="auto"/>
-      </w:pPr>
-      <w:r>
-        <w:t xml:space="preserve">SI LA SOL</w:t>
-      </w:r>
-    </w:p>
-    <w:p>
-      <w:pPr>
-        <w:spacing w:after="160" w:line="276" w:lineRule="auto"/>
-      </w:pPr>
-    </w:p>
-    <w:p>
-      <w:pPr>
-        <w:spacing w:after="160" w:line="276" w:lineRule="auto"/>
-      </w:pPr>
-      <w:r>
-        <w:t xml:space="preserve">SOL LA LA</w:t>
-      </w:r>
-    </w:p>
-    <w:p>
-      <w:pPr>
-        <w:spacing w:after="160" w:line="276" w:lineRule="auto"/>
-      </w:pPr>
-      <w:r>
-        <w:t xml:space="preserve">SI RE' SI DO'</w:t>
-      </w:r>
-    </w:p>
-    <w:p>
-      <w:pPr>
-        <w:spacing w:after="160" w:line="276" w:lineRule="auto"/>
-      </w:pPr>
-      <w:r>
-        <w:t xml:space="preserve">SOL SOL FA MI SOL</w:t>
-      </w:r>
-    </w:p>
-    <w:p>
-      <w:pPr>
-        <w:spacing w:after="160" w:line="276" w:lineRule="auto"/>
-      </w:pPr>
-      <w:r>
-        <w:t xml:space="preserve">SOL FA MI</w:t>
-      </w:r>
-    </w:p>
-    <w:p>
-      <w:pPr>
-        <w:spacing w:after="160" w:line="276" w:lineRule="auto"/>
-      </w:pPr>
-    </w:p>
-    <w:p>
-      <w:pPr>
-        <w:pStyle w:val="Heading2"/>
-        <w:spacing w:after="120" w:line="276" w:lineRule="auto"/>
-      </w:pPr>
-      <w:r>
-        <w:rPr>
-          <w:b/>
-          <w:sz w:val="26"/>
-          <w:szCs w:val="26"/>
-        </w:rPr>
-        <w:t xml:space="preserve">Segunda parte</w:t>
-      </w:r>
-    </w:p>
-    <w:p>
-      <w:pPr>
-        <w:spacing w:after="160" w:line="276" w:lineRule="auto"/>
-      </w:pPr>
-      <w:r>
-        <w:t xml:space="preserve">DO' DO' SI DO' RE' RE'</w:t>
-      </w:r>
-    </w:p>
-    <w:p>
-      <w:pPr>
-        <w:spacing w:after="160" w:line="276" w:lineRule="auto"/>
-      </w:pPr>
-      <w:r>
-        <w:t xml:space="preserve">DO' SI LA SOL</w:t>
-      </w:r>
-    </w:p>
-    <w:p>
-      <w:pPr>
-        <w:spacing w:after="160" w:line="276" w:lineRule="auto"/>
-      </w:pPr>
-    </w:p>
-    <w:p>
-      <w:pPr>
-        <w:spacing w:after="160" w:line="276" w:lineRule="auto"/>
-      </w:pPr>
-      <w:r>
-        <w:t xml:space="preserve">RE' RE' RE' RE' RE' RE'</w:t>
-      </w:r>
-    </w:p>
-    <w:p>
-      <w:pPr>
-        <w:spacing w:after="160" w:line="276" w:lineRule="auto"/>
-      </w:pPr>
-      <w:r>
-        <w:t xml:space="preserve">RE' MI' DO' RE'</w:t>
-      </w:r>
-    </w:p>
-    <w:p>
-      <w:pPr>
-        <w:spacing w:after="160" w:line="276" w:lineRule="auto"/>
-      </w:pPr>
-    </w:p>
-    <w:p>
-      <w:pPr>
-        <w:spacing w:after="160" w:line="276" w:lineRule="auto"/>
-      </w:pPr>
-      <w:r>
-        <w:t xml:space="preserve">RE' RE' RE' MI' FA'</w:t>
-      </w:r>
-    </w:p>
-    <w:p>
-      <w:pPr>
-        <w:spacing w:after="160" w:line="276" w:lineRule="auto"/>
-      </w:pPr>
-      <w:r>
-        <w:t xml:space="preserve">FA' FA' FA' FA' MI' DO'</w:t>
-      </w:r>
-    </w:p>
-    <w:p>
-      <w:pPr>
-        <w:spacing w:after="160" w:line="276" w:lineRule="auto"/>
-      </w:pPr>
-      <w:r>
-        <w:t xml:space="preserve">RE' MI' MI' RE' SI</w:t>
-      </w:r>
-    </w:p>
-    <w:p>
-      <w:pPr>
-        <w:spacing w:after="160" w:line="276" w:lineRule="auto"/>
-      </w:pPr>
-      <w:r>
-        <w:t xml:space="preserve">DO' RE' SI DO'</w:t>
-      </w:r>
-    </w:p>
-    <w:p>
-      <w:pPr>
-        <w:spacing w:after="160" w:line="276" w:lineRule="auto"/>
-      </w:pPr>
-    </w:p>
-    <w:p>
-      <w:pPr>
-        <w:spacing w:after="160" w:line="276" w:lineRule="auto"/>
-      </w:pPr>
-      <w:r>
-        <w:t xml:space="preserve">RE' RE' RE' MI' FA'</w:t>
-      </w:r>
-    </w:p>
-    <w:p>
-      <w:pPr>
-        <w:spacing w:after="160" w:line="276" w:lineRule="auto"/>
-      </w:pPr>
-      <w:r>
-        <w:t xml:space="preserve">FA' FA' FA' FA' MI' DO'</w:t>
-      </w:r>
-    </w:p>
-    <w:p>
-      <w:pPr>
-        <w:spacing w:after="160" w:line="276" w:lineRule="auto"/>
-      </w:pPr>
-      <w:r>
-        <w:t xml:space="preserve">RE' MI' MI' RE' SI</w:t>
-      </w:r>
-    </w:p>
-    <w:p>
-      <w:pPr>
-        <w:spacing w:after="160" w:line="276" w:lineRule="auto"/>
-      </w:pPr>
-      <w:r>
-        <w:t xml:space="preserve">DO' RE' SI DO'</w:t>
-      </w:r>
-    </w:p>
+    <w:tbl>
+      <w:tblPr>
+        <w:tblW w:w="13954" w:type="dxa"/>
+        <w:tblBorders>
+          <w:top w:val="none" w:sz="0" w:space="0"/>
+          <w:left w:val="none" w:sz="0" w:space="0"/>
+          <w:bottom w:val="none" w:sz="0" w:space="0"/>
+          <w:right w:val="none" w:sz="0" w:space="0"/>
+          <w:insideH w:val="none" w:sz="0" w:space="0"/>
+          <w:insideV w:val="single" w:sz="6" w:space="0" w:color="1F3864"/>
+        </w:tblBorders>
+        <w:tblLayout w:type="fixed"/>
+      </w:tblPr>
+      <w:tblGrid>
+        <w:gridCol w:w="6977"/>
+        <w:gridCol w:w="6977"/>
+      </w:tblGrid>
+      <w:tr>
+        <w:tc>
+          <w:tcPr>
+            <w:tcW w:w="6977" w:type="dxa"/>
+            <w:tcMar>
+              <w:top w:w="0" w:type="dxa"/>
+              <w:left w:w="0" w:type="dxa"/>
+              <w:bottom w:w="0" w:type="dxa"/>
+              <w:right w:w="200" w:type="dxa"/>
+            </w:tcMar>
+          </w:tcPr>
+          <w:p>
+            <w:pPr>
+              <w:pStyle w:val="Heading2"/>
+              <w:spacing w:after="120" w:line="276" w:lineRule="auto"/>
+            </w:pPr>
+            <w:r>
+              <w:rPr>
+                <w:b/>
+                <w:sz w:val="26"/>
+                <w:szCs w:val="26"/>
+              </w:rPr>
+              <w:t xml:space="preserve">Primera parte</w:t>
+            </w:r>
+          </w:p>
+          <w:p>
+            <w:pPr>
+              <w:spacing w:after="160" w:line="276" w:lineRule="auto"/>
+            </w:pPr>
+            <w:r>
+              <w:t xml:space="preserve">SI DO' DO'</w:t>
+            </w:r>
+          </w:p>
+          <w:p>
+            <w:pPr>
+              <w:spacing w:after="160" w:line="276" w:lineRule="auto"/>
+            </w:pPr>
+            <w:r>
+              <w:t xml:space="preserve">RE' MI' RE' DO'</w:t>
+            </w:r>
+          </w:p>
+          <w:p>
+            <w:pPr>
+              <w:spacing w:after="160" w:line="276" w:lineRule="auto"/>
+            </w:pPr>
+            <w:r>
+              <w:t xml:space="preserve">DO' DO' SI LA DO'</w:t>
+            </w:r>
+          </w:p>
+          <w:p>
+            <w:pPr>
+              <w:spacing w:after="160" w:line="276" w:lineRule="auto"/>
+            </w:pPr>
+            <w:r>
+              <w:t xml:space="preserve">SI LA SOL</w:t>
+            </w:r>
+          </w:p>
+          <w:p>
+            <w:pPr>
+              <w:spacing w:after="160" w:line="276" w:lineRule="auto"/>
+            </w:pPr>
+          </w:p>
+          <w:p>
+            <w:pPr>
+              <w:spacing w:after="160" w:line="276" w:lineRule="auto"/>
+            </w:pPr>
+            <w:r>
+              <w:t xml:space="preserve">SOL LA LA</w:t>
+            </w:r>
+          </w:p>
+          <w:p>
+            <w:pPr>
+              <w:spacing w:after="160" w:line="276" w:lineRule="auto"/>
+            </w:pPr>
+            <w:r>
+              <w:t xml:space="preserve">SI RE' SI DO'</w:t>
+            </w:r>
+          </w:p>
+          <w:p>
+            <w:pPr>
+              <w:spacing w:after="160" w:line="276" w:lineRule="auto"/>
+            </w:pPr>
+            <w:r>
+              <w:t xml:space="preserve">SOL SOL FA MI SOL</w:t>
+            </w:r>
+          </w:p>
+          <w:p>
+            <w:pPr>
+              <w:spacing w:after="160" w:line="276" w:lineRule="auto"/>
+            </w:pPr>
+            <w:r>
+              <w:t xml:space="preserve">SOL FA MI</w:t>
+            </w:r>
+          </w:p>
+          <w:p>
+            <w:pPr>
+              <w:spacing w:after="160" w:line="276" w:lineRule="auto"/>
+            </w:pPr>
+          </w:p>
+          <w:p>
+            <w:pPr>
+              <w:spacing w:after="160" w:line="276" w:lineRule="auto"/>
+            </w:pPr>
+            <w:r>
+              <w:t xml:space="preserve">(X2)</w:t>
+            </w:r>
+          </w:p>
+        </w:tc>
+        <w:tc>
+          <w:tcPr>
+            <w:tcW w:w="6977" w:type="dxa"/>
+            <w:tcMar>
+              <w:top w:w="0" w:type="dxa"/>
+              <w:left w:w="200" w:type="dxa"/>
+              <w:bottom w:w="0" w:type="dxa"/>
+              <w:right w:w="0" w:type="dxa"/>
+            </w:tcMar>
+          </w:tcPr>
+          <w:p>
+            <w:pPr>
+              <w:pStyle w:val="Heading2"/>
+              <w:spacing w:after="120" w:line="276" w:lineRule="auto"/>
+            </w:pPr>
+            <w:r>
+              <w:rPr>
+                <w:b/>
+                <w:sz w:val="26"/>
+                <w:szCs w:val="26"/>
+              </w:rPr>
+              <w:t xml:space="preserve">Segunda parte</w:t>
+            </w:r>
+          </w:p>
+          <w:p>
+            <w:pPr>
+              <w:spacing w:after="160" w:line="276" w:lineRule="auto"/>
+            </w:pPr>
+            <w:r>
+              <w:t xml:space="preserve">DO' DO' SI DO' RE' RE'</w:t>
+            </w:r>
+          </w:p>
+          <w:p>
+            <w:pPr>
+              <w:spacing w:after="160" w:line="276" w:lineRule="auto"/>
+            </w:pPr>
+            <w:r>
+              <w:t xml:space="preserve">DO' SI LA SOL</w:t>
+            </w:r>
+          </w:p>
+          <w:p>
+            <w:pPr>
+              <w:spacing w:after="160" w:line="276" w:lineRule="auto"/>
+            </w:pPr>
+          </w:p>
+          <w:p>
+            <w:pPr>
+              <w:spacing w:after="160" w:line="276" w:lineRule="auto"/>
+            </w:pPr>
+            <w:r>
+              <w:t xml:space="preserve">RE' RE' RE' RE' RE' RE'</w:t>
+            </w:r>
+          </w:p>
+          <w:p>
+            <w:pPr>
+              <w:spacing w:after="160" w:line="276" w:lineRule="auto"/>
+            </w:pPr>
+            <w:r>
+              <w:t xml:space="preserve">RE' MI' DO' RE'</w:t>
+            </w:r>
+          </w:p>
+          <w:p>
+            <w:pPr>
+              <w:spacing w:after="160" w:line="276" w:lineRule="auto"/>
+            </w:pPr>
+          </w:p>
+          <w:p>
+            <w:pPr>
+              <w:spacing w:after="160" w:line="276" w:lineRule="auto"/>
+            </w:pPr>
+            <w:r>
+              <w:t xml:space="preserve">RE' RE' RE' MI' FA'</w:t>
+            </w:r>
+          </w:p>
+          <w:p>
+            <w:pPr>
+              <w:spacing w:after="160" w:line="276" w:lineRule="auto"/>
+            </w:pPr>
+            <w:r>
+              <w:t xml:space="preserve">FA' FA' FA' FA' MI' DO'</w:t>
+            </w:r>
+          </w:p>
+          <w:p>
+            <w:pPr>
+              <w:spacing w:after="160" w:line="276" w:lineRule="auto"/>
+            </w:pPr>
+            <w:r>
+              <w:t xml:space="preserve">RE' MI' MI' RE' SI</w:t>
+            </w:r>
+          </w:p>
+          <w:p>
+            <w:pPr>
+              <w:spacing w:after="160" w:line="276" w:lineRule="auto"/>
+            </w:pPr>
+            <w:r>
+              <w:t xml:space="preserve">DO' RE' SI DO'</w:t>
+            </w:r>
+          </w:p>
+          <w:p>
+            <w:pPr>
+              <w:spacing w:after="160" w:line="276" w:lineRule="auto"/>
+            </w:pPr>
+          </w:p>
+          <w:p>
+            <w:pPr>
+              <w:spacing w:after="160" w:line="276" w:lineRule="auto"/>
+            </w:pPr>
+            <w:r>
+              <w:t xml:space="preserve">RE' RE' RE' MI' FA'</w:t>
+            </w:r>
+          </w:p>
+          <w:p>
+            <w:pPr>
+              <w:spacing w:after="160" w:line="276" w:lineRule="auto"/>
+            </w:pPr>
+            <w:r>
+              <w:t xml:space="preserve">FA' FA' FA' FA' MI' DO'</w:t>
+            </w:r>
+          </w:p>
+          <w:p>
+            <w:pPr>
+              <w:spacing w:after="160" w:line="276" w:lineRule="auto"/>
+            </w:pPr>
+            <w:r>
+              <w:t xml:space="preserve">RE' MI' MI' RE' SI</w:t>
+            </w:r>
+          </w:p>
+          <w:p>
+            <w:pPr>
+              <w:spacing w:after="160" w:line="276" w:lineRule="auto"/>
+            </w:pPr>
+            <w:r>
+              <w:t xml:space="preserve">DO' RE' SI DO'</w:t>
+            </w:r>
+          </w:p>
+        </w:tc>
+      </w:tr>
+    </w:tbl>
     <w:p>
       <w:pPr>
         <w:spacing w:after="160" w:line="276" w:lineRule="auto"/>

</xml_diff>